<commit_message>
Genracion de worf en pdf
</commit_message>
<xml_diff>
--- a/plantilla_pagare_kapitaliza.docx
+++ b/plantilla_pagare_kapitaliza.docx
@@ -65,13 +65,6 @@
                 <w:b/>
                 <w:highlight w:val="lightGray"/>
               </w:rPr>
-              <w:t>$</w:t>
-            </w:r>
-            <w:r>
-              <w:rPr>
-                <w:b/>
-                <w:highlight w:val="lightGray"/>
-              </w:rPr>
               <w:fldChar w:fldCharType="begin"/>
             </w:r>
             <w:r>
@@ -161,7 +154,7 @@
         <w:t xml:space="preserve"> </w:t>
       </w:r>
       <w:r>
-        <w:t>reconoce deber y se obliga a pagar incondicionalmente la cantidad de $</w:t>
+        <w:t xml:space="preserve">reconoce deber y se obliga a pagar incondicionalmente la cantidad de </w:t>
       </w:r>
       <w:r>
         <w:rPr>
@@ -203,18 +196,28 @@
         <w:t xml:space="preserve"> </w:t>
       </w:r>
       <w:r>
-        <w:t>(</w:t>
-      </w:r>
-      <w:fldSimple w:instr=" MERGEFIELD  Monto_Letra  \* MERGEFORMAT ">
-        <w:r>
-          <w:rPr>
-            <w:noProof/>
-          </w:rPr>
-          <w:t>«Monto_Letra»</w:t>
-        </w:r>
-      </w:fldSimple>
-      <w:r>
-        <w:t>) a la orden de</w:t>
+        <w:fldChar w:fldCharType="begin"/>
+      </w:r>
+      <w:r>
+        <w:instrText xml:space="preserve"> MERGEFIELD  Monto_Letra  \* MERGEFORMAT </w:instrText>
+      </w:r>
+      <w:r>
+        <w:fldChar w:fldCharType="separate"/>
+      </w:r>
+      <w:r>
+        <w:rPr>
+          <w:noProof/>
+        </w:rPr>
+        <w:t>«Monto_Letra»</w:t>
+      </w:r>
+      <w:r>
+        <w:rPr>
+          <w:noProof/>
+        </w:rPr>
+        <w:fldChar w:fldCharType="end"/>
+      </w:r>
+      <w:r>
+        <w:t xml:space="preserve"> a la orden de</w:t>
       </w:r>
       <w:r>
         <w:rPr>
@@ -343,14 +346,27 @@
       <w:r>
         <w:t xml:space="preserve">a </w:t>
       </w:r>
-      <w:fldSimple w:instr=" MERGEFIELD  Fecha_Emision  \* MERGEFORMAT ">
-        <w:r>
-          <w:rPr>
-            <w:noProof/>
-          </w:rPr>
-          <w:t>«Fecha_Emision»</w:t>
-        </w:r>
-      </w:fldSimple>
+      <w:r>
+        <w:fldChar w:fldCharType="begin"/>
+      </w:r>
+      <w:r>
+        <w:instrText xml:space="preserve"> MERGEFIELD  Fecha_Emision  \* MERGEFORMAT </w:instrText>
+      </w:r>
+      <w:r>
+        <w:fldChar w:fldCharType="separate"/>
+      </w:r>
+      <w:r>
+        <w:rPr>
+          <w:noProof/>
+        </w:rPr>
+        <w:t>«Fecha_Emision»</w:t>
+      </w:r>
+      <w:r>
+        <w:rPr>
+          <w:noProof/>
+        </w:rPr>
+        <w:fldChar w:fldCharType="end"/>
+      </w:r>
       <w:r>
         <w:br/>
       </w:r>

</xml_diff>

<commit_message>
Correccion de word base direccion
</commit_message>
<xml_diff>
--- a/plantilla_pagare_kapitaliza.docx
+++ b/plantilla_pagare_kapitaliza.docx
@@ -195,27 +195,14 @@
       <w:r>
         <w:t xml:space="preserve"> </w:t>
       </w:r>
-      <w:r>
-        <w:fldChar w:fldCharType="begin"/>
-      </w:r>
-      <w:r>
-        <w:instrText xml:space="preserve"> MERGEFIELD  Monto_Letra  \* MERGEFORMAT </w:instrText>
-      </w:r>
-      <w:r>
-        <w:fldChar w:fldCharType="separate"/>
-      </w:r>
-      <w:r>
-        <w:rPr>
-          <w:noProof/>
-        </w:rPr>
-        <w:t>«Monto_Letra»</w:t>
-      </w:r>
-      <w:r>
-        <w:rPr>
-          <w:noProof/>
-        </w:rPr>
-        <w:fldChar w:fldCharType="end"/>
-      </w:r>
+      <w:fldSimple w:instr=" MERGEFIELD  Monto_Letra  \* MERGEFORMAT ">
+        <w:r>
+          <w:rPr>
+            <w:noProof/>
+          </w:rPr>
+          <w:t>«Monto_Letra»</w:t>
+        </w:r>
+      </w:fldSimple>
       <w:r>
         <w:t xml:space="preserve"> a la orden de</w:t>
       </w:r>
@@ -346,27 +333,14 @@
       <w:r>
         <w:t xml:space="preserve">a </w:t>
       </w:r>
-      <w:r>
-        <w:fldChar w:fldCharType="begin"/>
-      </w:r>
-      <w:r>
-        <w:instrText xml:space="preserve"> MERGEFIELD  Fecha_Emision  \* MERGEFORMAT </w:instrText>
-      </w:r>
-      <w:r>
-        <w:fldChar w:fldCharType="separate"/>
-      </w:r>
-      <w:r>
-        <w:rPr>
-          <w:noProof/>
-        </w:rPr>
-        <w:t>«Fecha_Emision»</w:t>
-      </w:r>
-      <w:r>
-        <w:rPr>
-          <w:noProof/>
-        </w:rPr>
-        <w:fldChar w:fldCharType="end"/>
-      </w:r>
+      <w:fldSimple w:instr=" MERGEFIELD  Fecha_Emision  \* MERGEFORMAT ">
+        <w:r>
+          <w:rPr>
+            <w:noProof/>
+          </w:rPr>
+          <w:t>«Fecha_Emision»</w:t>
+        </w:r>
+      </w:fldSimple>
       <w:r>
         <w:br/>
       </w:r>
@@ -399,8 +373,13 @@
       <w:pPr>
         <w:jc w:val="center"/>
       </w:pPr>
-      <w:r>
-        <w:t>Firma :_______________________</w:t>
+      <w:proofErr w:type="gramStart"/>
+      <w:r>
+        <w:t>Firma :</w:t>
+      </w:r>
+      <w:proofErr w:type="gramEnd"/>
+      <w:r>
+        <w:t>_______________________</w:t>
       </w:r>
     </w:p>
     <w:p>
@@ -408,9 +387,11 @@
         <w:spacing w:after="0"/>
         <w:jc w:val="center"/>
       </w:pPr>
+      <w:proofErr w:type="gramStart"/>
       <w:r>
         <w:t>Nombre:_</w:t>
       </w:r>
+      <w:proofErr w:type="gramEnd"/>
       <w:r>
         <w:t xml:space="preserve"> </w:t>
       </w:r>
@@ -464,7 +445,38 @@
         <w:rPr>
           <w:u w:val="single"/>
         </w:rPr>
-        <w:t xml:space="preserve"> P DE LA CEREZA, #23, Col. SANTA TERESA, Santa Teresa 1, Huehuetoca, C.P. 54694</w:t>
+        <w:t xml:space="preserve"> </w:t>
+      </w:r>
+      <w:r>
+        <w:rPr>
+          <w:u w:val="single"/>
+        </w:rPr>
+        <w:fldChar w:fldCharType="begin"/>
+      </w:r>
+      <w:r>
+        <w:rPr>
+          <w:u w:val="single"/>
+        </w:rPr>
+        <w:instrText xml:space="preserve"> MERGEFIELD  Direccion_Cliente  \* MERGEFORMAT </w:instrText>
+      </w:r>
+      <w:r>
+        <w:rPr>
+          <w:u w:val="single"/>
+        </w:rPr>
+        <w:fldChar w:fldCharType="separate"/>
+      </w:r>
+      <w:r>
+        <w:rPr>
+          <w:noProof/>
+          <w:u w:val="single"/>
+        </w:rPr>
+        <w:t>«Direccion_Cliente»</w:t>
+      </w:r>
+      <w:r>
+        <w:rPr>
+          <w:u w:val="single"/>
+        </w:rPr>
+        <w:fldChar w:fldCharType="end"/>
       </w:r>
     </w:p>
     <w:sectPr>

</xml_diff>